<commit_message>
Working CPI estimator, more prompts
Working on formatter prompts, CPI forecastrer prompts, and adjust/merge prompts.
</commit_message>
<xml_diff>
--- a/PySupport/AdjustedNasdaq/docs/Citation.docx
+++ b/PySupport/AdjustedNasdaq/docs/Citation.docx
@@ -33,6 +33,16 @@
       <w:r>
         <w:t>Data Source:</w:t>
       </w:r>
+      <w:r>
+        <w:t xml:space="preserve"> </w:t>
+      </w:r>
+      <w:r>
+        <w:rPr>
+          <w:b/>
+          <w:bCs/>
+        </w:rPr>
+        <w:t>NASDAQ Composite (NASDAQCOM)</w:t>
+      </w:r>
     </w:p>
     <w:p>
       <w:pPr>
@@ -42,10 +52,9 @@
         <w:rPr>
           <w:noProof/>
         </w:rPr>
-        <w:lastRenderedPageBreak/>
         <w:drawing>
-          <wp:inline distT="0" distB="0" distL="0" distR="0" wp14:anchorId="00F2DDC1" wp14:editId="00165D5E">
-            <wp:extent cx="8685363" cy="5457825"/>
+          <wp:inline distT="0" distB="0" distL="0" distR="0" wp14:anchorId="00F2DDC1" wp14:editId="400EF8F6">
+            <wp:extent cx="7797348" cy="4899803"/>
             <wp:effectExtent l="0" t="0" r="1905" b="0"/>
             <wp:docPr id="523980718" name="Picture 2"/>
             <wp:cNvGraphicFramePr>
@@ -76,7 +85,7 @@
                   <pic:spPr bwMode="auto">
                     <a:xfrm>
                       <a:off x="0" y="0"/>
-                      <a:ext cx="8705763" cy="5470644"/>
+                      <a:ext cx="7797348" cy="4899803"/>
                     </a:xfrm>
                     <a:prstGeom prst="rect">
                       <a:avLst/>
@@ -286,6 +295,9 @@
     <w:p>
       <w:pPr>
         <w:spacing w:after="0" w:line="240" w:lineRule="auto"/>
+        <w:rPr>
+          <w:rFonts w:cstheme="minorHAnsi"/>
+        </w:rPr>
       </w:pPr>
       <w:r>
         <w:rPr>
@@ -338,6 +350,95 @@
           </wp:inline>
         </w:drawing>
       </w:r>
+    </w:p>
+    <w:p>
+      <w:pPr>
+        <w:spacing w:after="0" w:line="240" w:lineRule="auto"/>
+        <w:rPr>
+          <w:rFonts w:cstheme="minorHAnsi"/>
+        </w:rPr>
+      </w:pPr>
+    </w:p>
+    <w:p>
+      <w:pPr>
+        <w:pStyle w:val="Heading2"/>
+      </w:pPr>
+      <w:r>
+        <w:lastRenderedPageBreak/>
+        <w:t>Sample Chained CPI for all Urban Consumers</w:t>
+      </w:r>
+    </w:p>
+    <w:p>
+      <w:pPr>
+        <w:spacing w:after="0" w:line="240" w:lineRule="auto"/>
+        <w:rPr>
+          <w:rFonts w:cstheme="minorHAnsi"/>
+        </w:rPr>
+      </w:pPr>
+      <w:r>
+        <w:rPr>
+          <w:rFonts w:cstheme="minorHAnsi"/>
+          <w:noProof/>
+        </w:rPr>
+        <w:drawing>
+          <wp:inline distT="0" distB="0" distL="0" distR="0" wp14:anchorId="64D20F8B" wp14:editId="44D277C0">
+            <wp:extent cx="8525390" cy="4606012"/>
+            <wp:effectExtent l="0" t="0" r="0" b="4445"/>
+            <wp:docPr id="1049260492" name="Picture 1"/>
+            <wp:cNvGraphicFramePr>
+              <a:graphicFrameLocks xmlns:a="http://schemas.openxmlformats.org/drawingml/2006/main" noChangeAspect="1"/>
+            </wp:cNvGraphicFramePr>
+            <a:graphic xmlns:a="http://schemas.openxmlformats.org/drawingml/2006/main">
+              <a:graphicData uri="http://schemas.openxmlformats.org/drawingml/2006/picture">
+                <pic:pic xmlns:pic="http://schemas.openxmlformats.org/drawingml/2006/picture">
+                  <pic:nvPicPr>
+                    <pic:cNvPr id="0" name="Picture 2"/>
+                    <pic:cNvPicPr>
+                      <a:picLocks noChangeAspect="1" noChangeArrowheads="1"/>
+                    </pic:cNvPicPr>
+                  </pic:nvPicPr>
+                  <pic:blipFill>
+                    <a:blip r:embed="rId11">
+                      <a:extLst>
+                        <a:ext uri="{28A0092B-C50C-407E-A947-70E740481C1C}">
+                          <a14:useLocalDpi xmlns:a14="http://schemas.microsoft.com/office/drawing/2010/main" val="0"/>
+                        </a:ext>
+                      </a:extLst>
+                    </a:blip>
+                    <a:srcRect/>
+                    <a:stretch>
+                      <a:fillRect/>
+                    </a:stretch>
+                  </pic:blipFill>
+                  <pic:spPr bwMode="auto">
+                    <a:xfrm>
+                      <a:off x="0" y="0"/>
+                      <a:ext cx="8569599" cy="4629897"/>
+                    </a:xfrm>
+                    <a:prstGeom prst="rect">
+                      <a:avLst/>
+                    </a:prstGeom>
+                    <a:noFill/>
+                  </pic:spPr>
+                </pic:pic>
+              </a:graphicData>
+            </a:graphic>
+          </wp:inline>
+        </w:drawing>
+      </w:r>
+    </w:p>
+    <w:p>
+      <w:pPr>
+        <w:spacing w:after="0" w:line="240" w:lineRule="auto"/>
+        <w:rPr>
+          <w:rFonts w:cstheme="minorHAnsi"/>
+        </w:rPr>
+      </w:pPr>
+    </w:p>
+    <w:p>
+      <w:pPr>
+        <w:spacing w:after="0" w:line="240" w:lineRule="auto"/>
+      </w:pPr>
       <w:r>
         <w:rPr>
           <w:rFonts w:cstheme="minorHAnsi"/>

</xml_diff>